<commit_message>
Updated HOPE rulebook v2
</commit_message>
<xml_diff>
--- a/HOPE_AI_Challenge_2026_Rules_EN.docx
+++ b/HOPE_AI_Challenge_2026_Rules_EN.docx
@@ -128,7 +128,7 @@
           <w:sz w:val="22"/>
           <w:szCs w:val="22"/>
         </w:rPr>
-        <w:t xml:space="preserve">(2) Each team may register at most 8 members in total. No distinction is made between competitors, instructors and coaches — all are registered as team members. At most 2 of these registered members may enter the competition area during a match, and they must be designated from the registered list by the team itself before each match and verified by the check-in referee.</w:t>
+        <w:t xml:space="preserve">(2) Each team may register at most 8 members in total. No distinction is made between competitors, instructors and coaches — all are registered as team members. At most 3 of these registered members may enter the competition area during a match, and they must be designated from the registered list by the team itself before each match and verified by the check-in referee.</w:t>
       </w:r>
     </w:p>
     <w:p>
@@ -455,7 +455,7 @@
                 <w:sz w:val="20"/>
                 <w:szCs w:val="20"/>
               </w:rPr>
-              <w:t xml:space="preserve">The robot completes 3 consecutive stable serves (a legal service must first touch the server's own half once, then go over or around the net assembly and land in the valid area of the receiver's half-table; service legality is judged per §5.2(3))</w:t>
+              <w:t xml:space="preserve">The robot completes 3 consecutive stable serves (a legal service must first touch the server's own half once, then the receiver's half once, and, if not returned, leave the receiver's court across the far end line rather than either sideline; service legality is judged per §5.2(3))</w:t>
             </w:r>
           </w:p>
         </w:tc>
@@ -816,7 +816,7 @@
           <w:sz w:val="22"/>
           <w:szCs w:val="22"/>
         </w:rPr>
-        <w:t xml:space="preserve">(3) Locomotion capability. The robot must walk upright on two legs and be able to autonomously recover from a fall, or be assisted by team members after the umpire's permission. All motions must exhibit humanoid biomimetic characteristics (such as bipedal gait and upper-limb stroke motions). Non-humanoid structures or modes of motion (such as wheeled locomotion or non-limb striking devices) are not allowed. This rule does not require joint angles to match human joint angles strictly, but obvious motions inconsistent with humanoid biomechanics shall be avoided.</w:t>
+        <w:t xml:space="preserve">(3) Locomotion capability. The robot must walk upright on two legs. It may be designed for autonomous fall recovery; however, any fall after a game begins automatically loses that game under §5.5(2), whether or not the robot could later recover. All motions must exhibit humanoid biomimetic characteristics (such as bipedal gait and upper-limb stroke motions). Non-humanoid structures or modes of motion (such as wheeled locomotion or non-limb striking devices) are not allowed. This rule does not require joint angles to match human joint angles strictly, but obvious motions inconsistent with humanoid biomechanics shall be avoided.</w:t>
       </w:r>
     </w:p>
     <w:p>
@@ -1156,7 +1156,7 @@
           <w:sz w:val="22"/>
           <w:szCs w:val="22"/>
         </w:rPr>
-        <w:t xml:space="preserve">Unless they conflict with this section, the robot-vs-robot matches follow the current ITTF Laws of Table Tennis and the Olympic table-tennis rules. This event does not mandate the ITTF Expedite System (corresponding to ITTF §2.16); the umpire shall decide on the spot if expediting becomes necessary. The match format corresponds to ITTF §2.12 (A Match).</w:t>
+        <w:t xml:space="preserve">Unless they conflict with this section, the robot-vs-robot matches follow the current ITTF Laws of Table Tennis and the Olympic table-tennis rules. This event replaces the standard ITTF Expedite System with the mandatory HOPE Time Trigger and sudden-death procedure in clause (6) of this section. The match format corresponds to ITTF §2.12 (A Match).</w:t>
       </w:r>
     </w:p>
     <w:p>
@@ -1220,55 +1220,71 @@
           <w:sz w:val="22"/>
           <w:szCs w:val="22"/>
         </w:rPr>
-        <w:t xml:space="preserve">(4) Game format and score. Each match is best of 5 games (ITTF standard). A game is won by the first side to score 11 points unless both sides reach 10-all, in which case the game is won by the first side to gain a 2-point lead (corresponding to ITTF §2.11.1).</w:t>
-      </w:r>
-    </w:p>
-    <w:p>
-      <w:pPr>
-        <w:spacing w:after="60" w:before="60" w:line="320" w:lineRule="auto"/>
-        <w:jc w:val="both"/>
-      </w:pPr>
-      <w:r>
-        <w:rPr>
-          <w:rFonts w:ascii="Calibri" w:cs="Calibri" w:eastAsia="Calibri" w:hAnsi="Calibri"/>
-          <w:b w:val="false"/>
-          <w:bCs w:val="false"/>
-          <w:sz w:val="22"/>
-          <w:szCs w:val="22"/>
-        </w:rPr>
-        <w:t xml:space="preserve">(5) Service alternation. After each side has served 2 points in succession, the right of service alternates; from 10-all onward, each side serves 1 point in turn until the end of the game (corresponding to ITTF §2.13.2).</w:t>
-      </w:r>
-    </w:p>
-    <w:p>
-      <w:pPr>
-        <w:spacing w:after="60" w:before="60" w:line="320" w:lineRule="auto"/>
-        <w:jc w:val="both"/>
-      </w:pPr>
-      <w:r>
-        <w:rPr>
-          <w:rFonts w:ascii="Calibri" w:cs="Calibri" w:eastAsia="Calibri" w:hAnsi="Calibri"/>
-          <w:b w:val="false"/>
-          <w:bCs w:val="false"/>
-          <w:sz w:val="22"/>
-          <w:szCs w:val="22"/>
-        </w:rPr>
-        <w:t xml:space="preserve">(6) Change of ends. The two sides change ends at the end of each game. In the deciding game, the sides change ends once more when one side first reaches 5 points (corresponding to ITTF §2.14.1 and §2.14.2).</w:t>
-      </w:r>
-    </w:p>
-    <w:p>
-      <w:pPr>
-        <w:spacing w:after="60" w:before="60" w:line="320" w:lineRule="auto"/>
-        <w:jc w:val="both"/>
-      </w:pPr>
-      <w:r>
-        <w:rPr>
-          <w:rFonts w:ascii="Calibri" w:cs="Calibri" w:eastAsia="Calibri" w:hAnsi="Calibri"/>
-          <w:b w:val="false"/>
-          <w:bCs w:val="false"/>
-          <w:sz w:val="22"/>
-          <w:szCs w:val="22"/>
-        </w:rPr>
-        <w:t xml:space="preserve">(7) Inter-game break. There is a 5-minute break between every two games. During the break, the on-court members of the team may, within the competition area, perform any necessary hardware repair, module replacement, battery change or software debugging on the robot. At the end of the break the robot must again be in stand-by state and ready to receive the opening commands of the next game. Extension of the break is not allowed; in case of overrun the same penalty rule as in clause (1) of this section applies.</w:t>
+        <w:t xml:space="preserve">(4) Game format and score. Each match is best of 3 games, and the first side to win 2 games wins the match. A game is won by the first side to score 11 points unless both sides reach 10-all, in which case the game is won by the first side to gain a 2-point lead (corresponding to ITTF §2.11.1).</w:t>
+      </w:r>
+    </w:p>
+    <w:p>
+      <w:pPr>
+        <w:spacing w:after="60" w:before="60" w:line="320" w:lineRule="auto"/>
+        <w:jc w:val="both"/>
+      </w:pPr>
+      <w:r>
+        <w:rPr>
+          <w:rFonts w:ascii="Calibri" w:cs="Calibri" w:eastAsia="Calibri" w:hAnsi="Calibri"/>
+          <w:b w:val="false"/>
+          <w:bCs w:val="false"/>
+          <w:sz w:val="22"/>
+          <w:szCs w:val="22"/>
+        </w:rPr>
+        <w:t xml:space="preserve">(5) Service alternation. After each side has served 2 points in succession, the right of service alternates; from 10-all onward, each side serves 1 point in turn until the end of the game (corresponding to ITTF §2.13.3).</w:t>
+      </w:r>
+    </w:p>
+    <w:p>
+      <w:pPr>
+        <w:spacing w:after="60" w:before="60" w:line="320" w:lineRule="auto"/>
+        <w:jc w:val="both"/>
+      </w:pPr>
+      <w:r>
+        <w:rPr>
+          <w:rFonts w:ascii="Calibri" w:cs="Calibri" w:eastAsia="Calibri" w:hAnsi="Calibri"/>
+          <w:b w:val="false"/>
+          <w:bCs w:val="false"/>
+          <w:sz w:val="22"/>
+          <w:szCs w:val="22"/>
+        </w:rPr>
+        <w:t xml:space="preserve">(6) Time Trigger (HOPE sudden death). If a game remains unfinished when 10 minutes of play have elapsed from the start of that game, the umpire shall immediately interrupt play and activate the HOPE Time Trigger, regardless of the score or whether deuce has been reached. On resumption, the next side to win 1 point wins the game. This is a HOPE-specific sudden-death procedure and is not the standard ITTF Expedite System.</w:t>
+      </w:r>
+    </w:p>
+    <w:p>
+      <w:pPr>
+        <w:spacing w:after="60" w:before="60" w:line="320" w:lineRule="auto"/>
+        <w:jc w:val="both"/>
+      </w:pPr>
+      <w:r>
+        <w:rPr>
+          <w:rFonts w:ascii="Calibri" w:cs="Calibri" w:eastAsia="Calibri" w:hAnsi="Calibri"/>
+          <w:b w:val="false"/>
+          <w:bCs w:val="false"/>
+          <w:sz w:val="22"/>
+          <w:szCs w:val="22"/>
+        </w:rPr>
+        <w:t xml:space="preserve">(7) Change of ends. The two sides change ends at the end of each game. In the deciding game, the sides change ends once more when one side first reaches 5 points (corresponding to ITTF §2.14.1 and §2.14.2).</w:t>
+      </w:r>
+    </w:p>
+    <w:p>
+      <w:pPr>
+        <w:spacing w:after="60" w:before="60" w:line="320" w:lineRule="auto"/>
+        <w:jc w:val="both"/>
+      </w:pPr>
+      <w:r>
+        <w:rPr>
+          <w:rFonts w:ascii="Calibri" w:cs="Calibri" w:eastAsia="Calibri" w:hAnsi="Calibri"/>
+          <w:b w:val="false"/>
+          <w:bCs w:val="false"/>
+          <w:sz w:val="22"/>
+          <w:szCs w:val="22"/>
+        </w:rPr>
+        <w:t xml:space="preserve">(8) Inter-game break. There is a 5-minute break between every two games. During the break, the on-court members of the team may, within the competition area, perform any necessary hardware repair, module replacement, battery change or software debugging on the robot. At the end of the break the robot must again be in stand-by state and ready to receive the opening commands of the next game. Extension of the break is not allowed; in case of overrun the same penalty rule as in clause (1) of this section applies.</w:t>
       </w:r>
     </w:p>
     <w:p>
@@ -1349,7 +1365,7 @@
           <w:sz w:val="22"/>
           <w:szCs w:val="22"/>
         </w:rPr>
-        <w:t xml:space="preserve">(3) The served ball must first touch the server's half of the table once, then go over or around the net assembly and touch the valid area of the receiver's half-table.</w:t>
+        <w:t xml:space="preserve">(3) ITTF para-table-tennis service path. The served ball must first touch the server's half of the table once, then go over or around the net assembly and touch the receiver's half once. After this second bounce, if the ball is not returned, its path must carry it beyond the receiver's end line (the far-end boundary), not through either sideline. Consistent with ITTF §2.9.1.5, an otherwise correct service is a let and must be re-served if, after touching the receiver's half, the ball returns toward the net, comes to rest, or leaves the receiver's court through either sideline.</w:t>
       </w:r>
     </w:p>
     <w:p>
@@ -1494,7 +1510,7 @@
           <w:sz w:val="22"/>
           <w:szCs w:val="22"/>
         </w:rPr>
-        <w:t xml:space="preserve">(3) The following situations are scored as a let: a legal service in which the ball touches the net and then lands on the receiver's valid area; the receiver is not ready; the umpire suspends play; or the motion-capture system briefly drops out so that the rally cannot be judged (the last let condition is an addition of this event to ITTF §2.9).</w:t>
+        <w:t xml:space="preserve">(3) The following situations are scored as a let: a legal service in which the ball touches the net and then lands on the receiver's valid area; an otherwise correct service that, after touching the receiver's half, returns toward the net, comes to rest, or leaves the receiver's court through either sideline as specified in §5.2(3); the receiver is not ready; the umpire suspends play; or the motion-capture system briefly drops out so that the rally cannot be judged (the last let condition is an addition of this event to ITTF §2.9).</w:t>
       </w:r>
     </w:p>
     <w:p>
@@ -2340,55 +2356,55 @@
           <w:sz w:val="22"/>
           <w:szCs w:val="22"/>
         </w:rPr>
-        <w:t xml:space="preserve">(2) Handling of a fallen robot. If the robot falls during play, no more than 2 on-court team members may, with the umpire's permission, enter the competition area to lift the robot up and restart it to its initial state. They may NOT, on court, perform any software or hardware modification, parameter adjustment, debugging, battery change or external connection on the robot. From the moment the umpire whistles to signal the fall, the team has a 60-second recovery window in which to complete the lifting-up and restart so that the robot can enter the next rally. The match clock does not stop during the lift-up and restart.</w:t>
-      </w:r>
-    </w:p>
-    <w:p>
-      <w:pPr>
-        <w:spacing w:after="60" w:before="60" w:line="320" w:lineRule="auto"/>
-        <w:jc w:val="both"/>
-      </w:pPr>
-      <w:r>
-        <w:rPr>
-          <w:rFonts w:ascii="Calibri" w:cs="Calibri" w:eastAsia="Calibri" w:hAnsi="Calibri"/>
-          <w:b w:val="false"/>
-          <w:bCs w:val="false"/>
-          <w:sz w:val="22"/>
-          <w:szCs w:val="22"/>
-        </w:rPr>
-        <w:t xml:space="preserve">(3) Stacked penalties for late recovery. If, at the end of the first 60-second window after the fall, the robot still cannot enter the next rally, the team loses 1 point. For each additional 60-second window in which the robot still cannot enter play, an additional 1 point is lost.</w:t>
-      </w:r>
-    </w:p>
-    <w:p>
-      <w:pPr>
-        <w:spacing w:after="60" w:before="60" w:line="320" w:lineRule="auto"/>
-        <w:jc w:val="both"/>
-      </w:pPr>
-      <w:r>
-        <w:rPr>
-          <w:rFonts w:ascii="Calibri" w:cs="Calibri" w:eastAsia="Calibri" w:hAnsi="Calibri"/>
-          <w:b w:val="false"/>
-          <w:bCs w:val="false"/>
-          <w:sz w:val="22"/>
-          <w:szCs w:val="22"/>
-        </w:rPr>
-        <w:t xml:space="preserve">(4) Forfeit after three consecutive rallies. If the robot fails to enter play in 3 consecutive rallies (counting the rallies for which the per-60-s stacked penalties above were assessed), the game is forfeited (i.e. the opponent wins the game). Once the forfeit is declared, the game immediately ends and the next inter-game break under §5.1(7) begins. Example: the robot falls and cannot recover within 60 s — lose 1 point (counted as the 1st failed rally); the next rally begins but the robot again fails to respond to the service command, and after another 60 s — lose the 2nd point; a third such occurrence — after losing the 3rd point, the robot has failed 3 consecutive rallies in total, and the opponent wins the game.</w:t>
-      </w:r>
-    </w:p>
-    <w:p>
-      <w:pPr>
-        <w:spacing w:after="60" w:before="60" w:line="320" w:lineRule="auto"/>
-        <w:jc w:val="both"/>
-      </w:pPr>
-      <w:r>
-        <w:rPr>
-          <w:rFonts w:ascii="Calibri" w:cs="Calibri" w:eastAsia="Calibri" w:hAnsi="Calibri"/>
-          <w:b w:val="false"/>
-          <w:bCs w:val="false"/>
-          <w:sz w:val="22"/>
-          <w:szCs w:val="22"/>
-        </w:rPr>
-        <w:t xml:space="preserve">(5) Basis for the stacked penalty. Whether the robot "can enter the next rally" is determined solely by whether, upon the umpire's new start-of-rally command, the robot can respond normally, take its position, and serve or receive. The umpire and the technical referee jointly confirm the verdict.</w:t>
+        <w:t xml:space="preserve">(2) Automatic loss of a game for falling or inability to compete. After a game begins, if a robot falls or otherwise becomes unable to compete for a reason attributable to the robot or its team — including loss of balance or a mechanical, electrical, software or team-side communication failure — the umpire shall immediately award the current game (one set) to the opponent. A fall itself triggers this clause even if the robot could later recover. There is no in-game recovery window or sequence of point penalties.</w:t>
+      </w:r>
+    </w:p>
+    <w:p>
+      <w:pPr>
+        <w:spacing w:after="60" w:before="60" w:line="320" w:lineRule="auto"/>
+        <w:jc w:val="both"/>
+      </w:pPr>
+      <w:r>
+        <w:rPr>
+          <w:rFonts w:ascii="Calibri" w:cs="Calibri" w:eastAsia="Calibri" w:hAnsi="Calibri"/>
+          <w:b w:val="false"/>
+          <w:bCs w:val="false"/>
+          <w:sz w:val="22"/>
+          <w:szCs w:val="22"/>
+        </w:rPr>
+        <w:t xml:space="preserve">(3) No in-game human repair or recovery. Team members may not enter the competition area during a game to lift, restart, repair, adjust, debug, change a battery, reconnect or otherwise intervene with a robot that has fallen or become unable to compete. If immediate safety requires an emergency stop or physical intervention under clause (9), the umpire shall first stop play, but the robot side still loses the current game under clause (2). After the game result is declared, up to 3 designated on-court team members may handle the robot only during the inter-game break allowed by §5.1(8).</w:t>
+      </w:r>
+    </w:p>
+    <w:p>
+      <w:pPr>
+        <w:spacing w:after="60" w:before="60" w:line="320" w:lineRule="auto"/>
+        <w:jc w:val="both"/>
+      </w:pPr>
+      <w:r>
+        <w:rPr>
+          <w:rFonts w:ascii="Calibri" w:cs="Calibri" w:eastAsia="Calibri" w:hAnsi="Calibri"/>
+          <w:b w:val="false"/>
+          <w:bCs w:val="false"/>
+          <w:sz w:val="22"/>
+          <w:szCs w:val="22"/>
+        </w:rPr>
+        <w:t xml:space="preserve">(4) Readiness for the next game. Once the current game is awarded under clause (2), the next inter-game break under §5.1(8) begins. During that break, the team may repair or restart the robot, replace its battery, or make the same-model backup substitution permitted by §1(3). If the robot is still unable to compete when the break ends and the next game is called, it automatically loses that next game as well. This rule is applied game by game until the robot is ready or the match result has been decided.</w:t>
+      </w:r>
+    </w:p>
+    <w:p>
+      <w:pPr>
+        <w:spacing w:after="60" w:before="60" w:line="320" w:lineRule="auto"/>
+        <w:jc w:val="both"/>
+      </w:pPr>
+      <w:r>
+        <w:rPr>
+          <w:rFonts w:ascii="Calibri" w:cs="Calibri" w:eastAsia="Calibri" w:hAnsi="Calibri"/>
+          <w:b w:val="false"/>
+          <w:bCs w:val="false"/>
+          <w:sz w:val="22"/>
+          <w:szCs w:val="22"/>
+        </w:rPr>
+        <w:t xml:space="preserve">(5) Determination. A fall observed by the umpire automatically invokes clause (2). Any other inability to compete is jointly confirmed by the umpire and the technical referee based on whether the robot can respond normally, take its position, and serve or receive. A failure caused solely by the official HOPE Standard Motion-Capture System or another Organizing Committee facility is handled under clause (7) and does not invoke this automatic game-loss rule.</w:t>
       </w:r>
     </w:p>
     <w:p>
@@ -2420,7 +2436,7 @@
           <w:sz w:val="22"/>
           <w:szCs w:val="22"/>
         </w:rPr>
-        <w:t xml:space="preserve">(7) Motion-capture system failure. If the HOPE Standard Motion-Capture System fails, the umpire suspends play and the technical referee diagnoses the problem; the clock does not run and the score is not counted during the failure. After the system is restored, play resumes from the state of the last valid service before the failure.</w:t>
+        <w:t xml:space="preserve">(7) Organizing Committee facility failure. If the HOPE Standard Motion-Capture System or another Organizing Committee facility required for play fails, the umpire suspends play and the technical referee diagnoses the problem; the clock does not run and the score is not counted during the failure. After the facility is restored, play resumes from the state of the last valid service before the failure.</w:t>
       </w:r>
     </w:p>
     <w:p>
@@ -2452,7 +2468,7 @@
           <w:sz w:val="22"/>
           <w:szCs w:val="22"/>
         </w:rPr>
-        <w:t xml:space="preserve">(9) Emergency-stop response (unified rule — applies to both robot-vs-robot matches and the robot-vs-human exhibition match). Once an on-court team member (at most 2 per team) or any on-site referee presses the robot's emergency-stop button, the robot must stop all upper-limb and gait motion within 200 ms. The human player is NOT responsible for issuing the emergency-stop command; if the chief umpire blows the whistle to suspend play, the on-court team members must promptly press the emergency-stop button of their own robot. During the pre-match preparation time of every match (see §5.1(1)), the on-duty referee uses a referee stopwatch to measure the time from button trigger to full motion arrest, and decides whether the robot meets the 200 ms emergency-stop response requirement; a robot that fails the test is not allowed into the competition area for that match. On-site video and the robot's internal logs may serve as auxiliary evidence for response-time disputes.</w:t>
+        <w:t xml:space="preserve">(9) Emergency-stop response (unified rule — applies to both robot-vs-robot matches and the robot-vs-human exhibition match). Once an on-court team member (at most 3 per team) or any on-site referee presses the robot's emergency-stop button, the robot must stop all upper-limb and gait motion within 200 ms. The human player is NOT responsible for issuing the emergency-stop command; if the chief umpire blows the whistle to suspend play, the on-court team members must promptly press the emergency-stop button of their own robot. During the pre-match preparation time of every match (see §5.1(1)), the on-duty referee uses a referee stopwatch to measure the time from button trigger to full motion arrest, and decides whether the robot meets the 200 ms emergency-stop response requirement; a robot that fails the test is not allowed into the competition area for that match. On-site video and the robot's internal logs may serve as auxiliary evidence for response-time disputes.</w:t>
       </w:r>
     </w:p>
     <w:p>
@@ -3095,7 +3111,7 @@
                 <w:sz w:val="20"/>
                 <w:szCs w:val="20"/>
               </w:rPr>
-              <w:t xml:space="preserve">Suspend the match for 60 s and penalize per the fall-recovery rules below (see §5.5(2)–(4))</w:t>
+              <w:t xml:space="preserve">If attributable to the robot or team and the robot cannot compete, lose the current game; if caused by an official system failure, suspend play under §5.5(7)</w:t>
             </w:r>
           </w:p>
         </w:tc>
@@ -3166,7 +3182,7 @@
                 <w:sz w:val="20"/>
                 <w:szCs w:val="20"/>
               </w:rPr>
-              <w:t xml:space="preserve">Robot cannot enter the next rally within the first 60 s after a fall</w:t>
+              <w:t xml:space="preserve">Robot falls after a game begins</w:t>
             </w:r>
           </w:p>
         </w:tc>
@@ -3199,7 +3215,7 @@
                 <w:sz w:val="20"/>
                 <w:szCs w:val="20"/>
               </w:rPr>
-              <w:t xml:space="preserve">Lose 1 point</w:t>
+              <w:t xml:space="preserve">Lose the current game (one set)</w:t>
             </w:r>
           </w:p>
         </w:tc>
@@ -3232,7 +3248,7 @@
                 <w:sz w:val="20"/>
                 <w:szCs w:val="20"/>
               </w:rPr>
-              <w:t xml:space="preserve">See §5.5(3)</w:t>
+              <w:t xml:space="preserve">Automatic; see §5.5(2)</w:t>
             </w:r>
           </w:p>
         </w:tc>
@@ -3270,7 +3286,7 @@
                 <w:sz w:val="20"/>
                 <w:szCs w:val="20"/>
               </w:rPr>
-              <w:t xml:space="preserve">Robot fails to enter the next rally for each additional 60 s after a fall</w:t>
+              <w:t xml:space="preserve">Robot otherwise becomes unable to compete during a game</w:t>
             </w:r>
           </w:p>
         </w:tc>
@@ -3303,7 +3319,7 @@
                 <w:sz w:val="20"/>
                 <w:szCs w:val="20"/>
               </w:rPr>
-              <w:t xml:space="preserve">Lose 1 additional point</w:t>
+              <w:t xml:space="preserve">Lose the current game (one set)</w:t>
             </w:r>
           </w:p>
         </w:tc>
@@ -3336,7 +3352,7 @@
                 <w:sz w:val="20"/>
                 <w:szCs w:val="20"/>
               </w:rPr>
-              <w:t xml:space="preserve">Stacked penalty</w:t>
+              <w:t xml:space="preserve">Jointly confirmed under §5.5(5)</w:t>
             </w:r>
           </w:p>
         </w:tc>
@@ -3374,7 +3390,7 @@
                 <w:sz w:val="20"/>
                 <w:szCs w:val="20"/>
               </w:rPr>
-              <w:t xml:space="preserve">Robot fails to enter play for 3 consecutive rallies after a fall</w:t>
+              <w:t xml:space="preserve">Robot is not ready when the inter-game break ends</w:t>
             </w:r>
           </w:p>
         </w:tc>
@@ -3407,7 +3423,7 @@
                 <w:sz w:val="20"/>
                 <w:szCs w:val="20"/>
               </w:rPr>
-              <w:t xml:space="preserve">Forfeit the game (opponent wins the game)</w:t>
+              <w:t xml:space="preserve">Lose that next game (one set)</w:t>
             </w:r>
           </w:p>
         </w:tc>
@@ -3440,7 +3456,7 @@
                 <w:sz w:val="20"/>
                 <w:szCs w:val="20"/>
               </w:rPr>
-              <w:t xml:space="preserve">See §5.5(4)</w:t>
+              <w:t xml:space="preserve">See §5.5(4); repeat game by game if still unready</w:t>
             </w:r>
           </w:p>
         </w:tc>
@@ -3716,7 +3732,7 @@
           <w:sz w:val="22"/>
           <w:szCs w:val="22"/>
         </w:rPr>
-        <w:t xml:space="preserve">Apart from the violations whose specific point penalties are directly stated in the §5.6 penalty table, all "yellow-card warnings" mentioned elsewhere in this chapter and the resulting stacked penalties are uniformly governed by ITTF Handbook §3.5.2 (Misbehaviour, located in the Regulations for International Competitions). The clauses below specify how this is applied in this event:</w:t>
+        <w:t xml:space="preserve">Apart from the violations whose specific penalties are directly stated in the §5.6 penalty table, all "yellow-card warnings" mentioned elsewhere in this chapter and the resulting stacked penalties are uniformly governed by ITTF Handbook §3.5.2 (Misbehaviour, located in the Regulations for International Competitions). The clauses below specify how this is applied in this event:</w:t>
       </w:r>
     </w:p>
     <w:p>
@@ -3844,7 +3860,7 @@
           <w:sz w:val="22"/>
           <w:szCs w:val="22"/>
         </w:rPr>
-        <w:t xml:space="preserve">(8) Relation to technical/tactical point penalties. The technical and tactical violations listed in the §5.6 penalty table (such as service faults, the 10-second timeout, fall-recovery penalties, etc.) are awarded as direct point penalties per the table and do NOT count toward the yellow/red card escalation in this section. Yellow and red cards in this section apply only to disciplinary misconduct (such as on-court members exceeding the operator zone, improper protest of an umpire's decision, the robot producing unnecessary motion while under a static-state command, etc.). The two penalty mechanisms are applied independently and do not substitute for or offset each other.</w:t>
+        <w:t xml:space="preserve">(8) Relation to technical/tactical penalties. The technical and tactical violations listed in the §5.6 penalty table (such as service faults, the 10-second timeout, and automatic game-loss penalties for falling or inability to compete) are imposed directly per the table and do NOT count toward the yellow/red card escalation in this section. Yellow and red cards in this section apply only to disciplinary misconduct (such as on-court members exceeding the operator zone, improper protest of an umpire's decision, the robot producing unnecessary motion while under a static-state command, etc.). The two penalty mechanisms are applied independently and do not substitute for or offset each other.</w:t>
       </w:r>
     </w:p>
     <w:p>
@@ -4056,23 +4072,23 @@
           <w:sz w:val="22"/>
           <w:szCs w:val="22"/>
         </w:rPr>
-        <w:t xml:space="preserve">(1) The result of each robot-vs-robot match is determined by the best-of-5 format and scoring rules in §5.1.</w:t>
-      </w:r>
-    </w:p>
-    <w:p>
-      <w:pPr>
-        <w:spacing w:after="60" w:before="60" w:line="320" w:lineRule="auto"/>
-        <w:jc w:val="both"/>
-      </w:pPr>
-      <w:r>
-        <w:rPr>
-          <w:rFonts w:ascii="Calibri" w:cs="Calibri" w:eastAsia="Calibri" w:hAnsi="Calibri"/>
-          <w:b w:val="false"/>
-          <w:bCs w:val="false"/>
-          <w:sz w:val="22"/>
-          <w:szCs w:val="22"/>
-        </w:rPr>
-        <w:t xml:space="preserve">(2) If a match is suspended due to a robot fault, a motion-capture-system fault or other force majeure for more than 10 minutes without being restored, the umpire and the technical referee determine the result based on the games already completed and the score at the time of suspension, in the following priority order: (a) if one side has already won enough games to clinch the match (e.g., 3 games in a best-of-5), that side wins; (b) otherwise, compare the score of the current game and the leading side wins; (c) if the scores in the current game are tied, a single tie-breaker point is played to decide the match, with service for that point decided by a coin toss conducted by the umpire.</w:t>
+        <w:t xml:space="preserve">(1) The result of each robot-vs-robot match is determined by the best-of-3 format and scoring rules in §5.1.</w:t>
+      </w:r>
+    </w:p>
+    <w:p>
+      <w:pPr>
+        <w:spacing w:after="60" w:before="60" w:line="320" w:lineRule="auto"/>
+        <w:jc w:val="both"/>
+      </w:pPr>
+      <w:r>
+        <w:rPr>
+          <w:rFonts w:ascii="Calibri" w:cs="Calibri" w:eastAsia="Calibri" w:hAnsi="Calibri"/>
+          <w:b w:val="false"/>
+          <w:bCs w:val="false"/>
+          <w:sz w:val="22"/>
+          <w:szCs w:val="22"/>
+        </w:rPr>
+        <w:t xml:space="preserve">(2) If a match is suspended due to a robot fault, a motion-capture-system fault or other force majeure for more than 10 minutes without being restored, the umpire and the technical referee determine the result based on the games already completed and the score at the time of suspension, in the following priority order: (a) if one side has already won enough games to clinch the match (e.g., 2 games in a best-of-3), that side wins; (b) otherwise, compare the score of the current game and the leading side wins; (c) if the scores in the current game are tied, a single tie-breaker point is played to decide the match, with service for that point decided by a coin toss conducted by the umpire.</w:t>
       </w:r>
     </w:p>
     <w:p>
@@ -4526,7 +4542,7 @@
           <w:sz w:val="22"/>
           <w:szCs w:val="22"/>
         </w:rPr>
-        <w:t xml:space="preserve">(4) On-site personnel area. Apart from 2 engineers from the Robot Champion side, 1 sparring partner from the human player's team, the on-duty referees and the Organizing Committee's safety personnel, no one else is allowed in the competition area. Photography and videography must remain in their designated areas and must use non-flash equipment.</w:t>
+        <w:t xml:space="preserve">(4) On-site personnel area. Apart from 3 engineers from the Robot Champion side, 1 sparring partner from the human player's team, the on-duty referees and the Organizing Committee's safety personnel, no one else is allowed in the competition area. Photography and videography must remain in their designated areas and must use non-flash equipment.</w:t>
       </w:r>
     </w:p>
     <w:p>
@@ -4558,7 +4574,7 @@
           <w:sz w:val="22"/>
           <w:szCs w:val="22"/>
         </w:rPr>
-        <w:t xml:space="preserve">(6) Handling of a fallen robot and the stacked penalty follow §5.5(2)–(5). If the situation reaches the "three-consecutive-rally" threshold of §5.5(4), the exhibition match is terminated immediately and the Robot Champion is deemed to have forfeited the match.</w:t>
+        <w:t xml:space="preserve">(6) If the robot falls or otherwise becomes unable to compete after the exhibition game begins, §5.5(2)–(5) applies. Because the exhibition match is best of 1, the robot side immediately loses that game and the exhibition match ends; no in-game human repair or recovery is permitted.</w:t>
       </w:r>
     </w:p>
     <w:p>

</xml_diff>